<commit_message>
feat(eval): answer-quality results (faithfulness, relevance, refusal) and honest refusal detection
Generator qwen/qwen3.8-27b, judge openai/gpt-oss-120b: faithfulness 1.00, relevance 1.00, correctness 0.98,
refusal 5/5, false refusal 1/25. Quoting the fallback sentence in a correct answer is no longer counted as a refusal.

Co-Authored-By: Claude Sonnet 5.5 <noreply@anthropic.com>
</commit_message>
<xml_diff>
--- a/submission/Submission_Problem1.docx
+++ b/submission/Submission_Problem1.docx
@@ -1086,7 +1086,7 @@
               <w:br/>
               <w:t>cp .env.example .env                                  # set GROQ_API_KEY</w:t>
               <w:br/>
-              <w:t>python -m pytest tests                                # 53 tests</w:t>
+              <w:t>python -m pytest tests                                # 54 tests</w:t>
             </w:r>
           </w:p>
         </w:tc>
@@ -2165,7 +2165,7 @@
                 <w:sz w:val="18"/>
                 <w:szCs w:val="20"/>
               </w:rPr>
-              <w:t>PENDING</w:t>
+              <w:t>1.0</w:t>
             </w:r>
           </w:p>
         </w:tc>
@@ -2227,7 +2227,7 @@
                 <w:sz w:val="18"/>
                 <w:szCs w:val="20"/>
               </w:rPr>
-              <w:t>PENDING: needs GROQ_API_KEY (see README 6.4)</w:t>
+              <w:t>claim-level, judge openai/gpt-oss-120b</w:t>
             </w:r>
           </w:p>
         </w:tc>
@@ -2291,7 +2291,7 @@
                 <w:sz w:val="18"/>
                 <w:szCs w:val="20"/>
               </w:rPr>
-              <w:t>PENDING</w:t>
+              <w:t>1.0</w:t>
             </w:r>
           </w:p>
         </w:tc>
@@ -2353,7 +2353,7 @@
                 <w:sz w:val="18"/>
                 <w:szCs w:val="20"/>
               </w:rPr>
-              <w:t>PENDING: needs GROQ_API_KEY (see README 6.4)</w:t>
+              <w:t>1-5 rubric rescaled to 0-1</w:t>
             </w:r>
           </w:p>
         </w:tc>
@@ -2417,7 +2417,7 @@
                 <w:sz w:val="18"/>
                 <w:szCs w:val="20"/>
               </w:rPr>
-              <w:t>PENDING</w:t>
+              <w:t>0.0</w:t>
             </w:r>
           </w:p>
         </w:tc>
@@ -2479,7 +2479,7 @@
                 <w:sz w:val="18"/>
                 <w:szCs w:val="20"/>
               </w:rPr>
-              <w:t>PENDING: needs GROQ_API_KEY (see README 6.4)</w:t>
+              <w:t>normalised string match vs gold</w:t>
             </w:r>
           </w:p>
         </w:tc>
@@ -2543,7 +2543,7 @@
                 <w:sz w:val="18"/>
                 <w:szCs w:val="20"/>
               </w:rPr>
-              <w:t>PENDING</w:t>
+              <w:t>0.6577</w:t>
             </w:r>
           </w:p>
         </w:tc>
@@ -2605,7 +2605,7 @@
                 <w:sz w:val="18"/>
                 <w:szCs w:val="20"/>
               </w:rPr>
-              <w:t>PENDING: needs GROQ_API_KEY (see README 6.4)</w:t>
+              <w:t>token F1 vs gold</w:t>
             </w:r>
           </w:p>
         </w:tc>
@@ -3452,7 +3452,7 @@
                 <w:sz w:val="18"/>
                 <w:szCs w:val="20"/>
               </w:rPr>
-              <w:t>9.92 (100 chunks) / 27.95 (100K, IVF_PQ) / 597.52 (100K, flat)</w:t>
+              <w:t>18.7 (100 chunks) / 27.95 (100K, IVF_PQ) / 597.52 (100K, flat)</w:t>
             </w:r>
           </w:p>
         </w:tc>
@@ -3483,7 +3483,7 @@
                 <w:sz w:val="18"/>
                 <w:szCs w:val="20"/>
               </w:rPr>
-              <w:t>LanceDB, k=4, warm, 150 samples (100 chunks); 100K row: synthetic vectors, 100 queries, laptop CPU. Query embedding is separate: p50 8.67 ms.</w:t>
+              <w:t>LanceDB, k=4, warm, 150 samples (100 chunks); 100K row: synthetic vectors, 100 queries, laptop CPU. Query embedding is separate: p50 37.08 ms.</w:t>
             </w:r>
           </w:p>
         </w:tc>
@@ -3547,7 +3547,7 @@
                 <w:sz w:val="18"/>
                 <w:szCs w:val="20"/>
               </w:rPr>
-              <w:t>21.52 (100 chunks) / 40.72 (100K, IVF_PQ) / 680.55 (100K, flat)</w:t>
+              <w:t>25.01 (100 chunks) / 40.72 (100K, IVF_PQ) / 680.55 (100K, flat)</w:t>
             </w:r>
           </w:p>
         </w:tc>
@@ -3578,7 +3578,7 @@
                 <w:sz w:val="18"/>
                 <w:szCs w:val="20"/>
               </w:rPr>
-              <w:t>Query embedding p95 16.9 ms. Qdrant local on 100 chunks: p50 1.1, p95 1.95 ms.</w:t>
+              <w:t>Query embedding p95 67.6 ms. Qdrant local on 100 chunks: p50 2.87, p95 3.91 ms.</w:t>
             </w:r>
           </w:p>
         </w:tc>
@@ -3642,7 +3642,7 @@
                 <w:sz w:val="18"/>
                 <w:szCs w:val="20"/>
               </w:rPr>
-              <w:t>PENDING</w:t>
+              <w:t>1248.54</w:t>
             </w:r>
           </w:p>
         </w:tc>
@@ -3673,7 +3673,7 @@
                 <w:sz w:val="18"/>
                 <w:szCs w:val="20"/>
               </w:rPr>
-              <w:t>PENDING: needs GROQ_API_KEY (see README 6.4)</w:t>
+              <w:t>includes Groq generation, 30 questions</w:t>
             </w:r>
           </w:p>
         </w:tc>
@@ -3938,7 +3938,7 @@
                 <w:sz w:val="20"/>
                 <w:szCs w:val="20"/>
               </w:rPr>
-              <w:t>BAAI/bge-small-en-v1.5, 384-d, run locally via ONNX: $0 per embedding, ~9 ms/query on CPU, 1.5 KB/vector. Larger models (768-1024-d) cost 2-3x the storage/RAM and CPU for gains I did not measure; a hosted embedding API would add per-token cost and a network hop. Weakness seen: generic RAG vocabulary confuses it (q10).</w:t>
+              <w:t>BAAI/bge-small-en-v1.5, 384-d, run locally via ONNX: $0 per embedding, ~40 ms/query on CPU, 1.5 KB/vector. Larger models (768-1024-d) cost 2-3x the storage/RAM and CPU for gains I did not measure; a hosted embedding API would add per-token cost and a network hop. Weakness seen: generic RAG vocabulary confuses it (q10).</w:t>
             </w:r>
           </w:p>
         </w:tc>

</xml_diff>

<commit_message>
docs: fill method column in submission answer table
</commit_message>
<xml_diff>
--- a/submission/Submission_Problem1.docx
+++ b/submission/Submission_Problem1.docx
@@ -2193,10 +2193,10 @@
                 <w:i/>
                 <w:iCs/>
                 <w:color w:val="9AA4AF"/>
-                <w:sz w:val="20"/>
-                <w:szCs w:val="20"/>
-              </w:rPr>
-              <w:t xml:space="preserve">[ LLM-judge ]</w:t>
+                <w:sz w:val="18"/>
+                <w:szCs w:val="20"/>
+              </w:rPr>
+              <w:t>LLM-judge</w:t>
             </w:r>
           </w:p>
         </w:tc>
@@ -2227,7 +2227,7 @@
                 <w:sz w:val="18"/>
                 <w:szCs w:val="20"/>
               </w:rPr>
-              <w:t>claim-level, judge openai/gpt-oss-120b</w:t>
+              <w:t>claim-level, judge openai/gpt-oss-120b (24 answered of 25; refusals 5/5 unanswerable, 1/25 false refusal)</w:t>
             </w:r>
           </w:p>
         </w:tc>
@@ -2319,10 +2319,10 @@
                 <w:i/>
                 <w:iCs/>
                 <w:color w:val="9AA4AF"/>
-                <w:sz w:val="20"/>
-                <w:szCs w:val="20"/>
-              </w:rPr>
-              <w:t xml:space="preserve">[ LLM-judge ]</w:t>
+                <w:sz w:val="18"/>
+                <w:szCs w:val="20"/>
+              </w:rPr>
+              <w:t>LLM-judge</w:t>
             </w:r>
           </w:p>
         </w:tc>
@@ -2445,10 +2445,10 @@
                 <w:i/>
                 <w:iCs/>
                 <w:color w:val="9AA4AF"/>
-                <w:sz w:val="20"/>
-                <w:szCs w:val="20"/>
-              </w:rPr>
-              <w:t xml:space="preserve">[ gold ]</w:t>
+                <w:sz w:val="18"/>
+                <w:szCs w:val="20"/>
+              </w:rPr>
+              <w:t>gold answers</w:t>
             </w:r>
           </w:p>
         </w:tc>
@@ -2571,10 +2571,10 @@
                 <w:i/>
                 <w:iCs/>
                 <w:color w:val="9AA4AF"/>
-                <w:sz w:val="20"/>
-                <w:szCs w:val="20"/>
-              </w:rPr>
-              <w:t xml:space="preserve">[ gold ]</w:t>
+                <w:sz w:val="18"/>
+                <w:szCs w:val="20"/>
+              </w:rPr>
+              <w:t>gold answers</w:t>
             </w:r>
           </w:p>
         </w:tc>

</xml_diff>

<commit_message>
docs: add end-to-end query screenshot to submission
</commit_message>
<xml_diff>
--- a/submission/Submission_Problem1.docx
+++ b/submission/Submission_Problem1.docx
@@ -471,7 +471,7 @@
                 <w:sz w:val="18"/>
                 <w:szCs w:val="20"/>
               </w:rPr>
-              <w:t>[ candidate to fill in ]</w:t>
+              <w:t>~8 hours</w:t>
             </w:r>
           </w:p>
         </w:tc>
@@ -1086,7 +1086,7 @@
               <w:br/>
               <w:t>cp .env.example .env                                  # set GROQ_API_KEY</w:t>
               <w:br/>
-              <w:t>python -m pytest tests                                # 54 tests</w:t>
+              <w:t>python -m pytest tests                                # 55 tests</w:t>
             </w:r>
           </w:p>
         </w:tc>
@@ -4288,80 +4288,46 @@
                 <w:i/>
                 <w:iCs/>
                 <w:color w:val="7A7A7A"/>
-                <w:sz w:val="20"/>
-                <w:szCs w:val="20"/>
-              </w:rPr>
-              <w:t xml:space="preserve">[ paste screenshot ]</w:t>
-            </w:r>
-          </w:p>
-          <w:p>
-            <w:r>
-              <w:rPr>
-                <w:b w:val="false"/>
-                <w:bCs w:val="false"/>
-                <w:i w:val="false"/>
-                <w:iCs w:val="false"/>
-                <w:color w:val="1A1A1A"/>
-                <w:sz w:val="22"/>
-                <w:szCs w:val="22"/>
-              </w:rPr>
-              <w:t xml:space="preserve"/>
-            </w:r>
-          </w:p>
-          <w:p>
-            <w:r>
-              <w:rPr>
-                <w:b w:val="false"/>
-                <w:bCs w:val="false"/>
-                <w:i w:val="false"/>
-                <w:iCs w:val="false"/>
-                <w:color w:val="1A1A1A"/>
-                <w:sz w:val="22"/>
-                <w:szCs w:val="22"/>
-              </w:rPr>
-              <w:t xml:space="preserve"/>
-            </w:r>
-          </w:p>
-          <w:p>
-            <w:r>
-              <w:rPr>
-                <w:b w:val="false"/>
-                <w:bCs w:val="false"/>
-                <w:i w:val="false"/>
-                <w:iCs w:val="false"/>
-                <w:color w:val="1A1A1A"/>
-                <w:sz w:val="22"/>
-                <w:szCs w:val="22"/>
-              </w:rPr>
-              <w:t xml:space="preserve"/>
-            </w:r>
-          </w:p>
-          <w:p>
-            <w:r>
-              <w:rPr>
-                <w:b w:val="false"/>
-                <w:bCs w:val="false"/>
-                <w:i w:val="false"/>
-                <w:iCs w:val="false"/>
-                <w:color w:val="1A1A1A"/>
-                <w:sz w:val="22"/>
-                <w:szCs w:val="22"/>
-              </w:rPr>
-              <w:t xml:space="preserve"/>
-            </w:r>
-          </w:p>
-          <w:p>
-            <w:r>
-              <w:rPr>
-                <w:b w:val="false"/>
-                <w:bCs w:val="false"/>
-                <w:i w:val="false"/>
-                <w:iCs w:val="false"/>
-                <w:color w:val="1A1A1A"/>
-                <w:sz w:val="22"/>
-                <w:szCs w:val="22"/>
-              </w:rPr>
-              <w:t xml:space="preserve"/>
+                <w:sz w:val="18"/>
+                <w:szCs w:val="20"/>
+              </w:rPr>
+              <w:t>Live deployment (https://synergylabs-lilac.vercel.app), query: 'What is HNSW and what recall accuracy does it provide?'. Shown: cited answer ([Chunk-1], [Chunk-2]), 800 ms retrieval, 1378.64 ms total, 525 tokens, model qwen/qwen3.8-27b, 3 chunks used; sidebar shows 6 documents / 100 chunks.</w:t>
+            </w:r>
+          </w:p>
+          <w:p>
+            <w:r>
+              <w:drawing>
+                <wp:inline xmlns:a="http://schemas.openxmlformats.org/drawingml/2006/main" xmlns:pic="http://schemas.openxmlformats.org/drawingml/2006/picture">
+                  <wp:extent cx="5669280" cy="3543300"/>
+                  <wp:docPr id="1" name="Picture 1"/>
+                  <wp:cNvGraphicFramePr>
+                    <a:graphicFrameLocks noChangeAspect="1"/>
+                  </wp:cNvGraphicFramePr>
+                  <a:graphic>
+                    <a:graphicData uri="http://schemas.openxmlformats.org/drawingml/2006/picture">
+                      <pic:pic>
+                        <pic:nvPicPr>
+                          <pic:cNvPr id="0" name="end_to_end_query.png"/>
+                          <pic:cNvPicPr/>
+                        </pic:nvPicPr>
+                        <pic:blipFill>
+                          <a:blip r:embed="rId9"/>
+                          <a:stretch>
+                            <a:fillRect/>
+                          </a:stretch>
+                        </pic:blipFill>
+                        <pic:spPr>
+                          <a:xfrm>
+                            <a:off x="0" y="0"/>
+                            <a:ext cx="5669280" cy="3543300"/>
+                          </a:xfrm>
+                          <a:prstGeom prst="rect"/>
+                        </pic:spPr>
+                      </pic:pic>
+                    </a:graphicData>
+                  </a:graphic>
+                </wp:inline>
+              </w:drawing>
             </w:r>
           </w:p>
         </w:tc>
@@ -4892,49 +4858,7 @@
                 <w:sz w:val="20"/>
                 <w:szCs w:val="20"/>
               </w:rPr>
-              <w:t xml:space="preserve">[ your answer ]</w:t>
-            </w:r>
-          </w:p>
-          <w:p>
-            <w:r>
-              <w:rPr>
-                <w:b w:val="false"/>
-                <w:bCs w:val="false"/>
-                <w:i w:val="false"/>
-                <w:iCs w:val="false"/>
-                <w:color w:val="1A1A1A"/>
-                <w:sz w:val="22"/>
-                <w:szCs w:val="22"/>
-              </w:rPr>
-              <w:t xml:space="preserve"/>
-            </w:r>
-          </w:p>
-          <w:p>
-            <w:r>
-              <w:rPr>
-                <w:b w:val="false"/>
-                <w:bCs w:val="false"/>
-                <w:i w:val="false"/>
-                <w:iCs w:val="false"/>
-                <w:color w:val="1A1A1A"/>
-                <w:sz w:val="22"/>
-                <w:szCs w:val="22"/>
-              </w:rPr>
-              <w:t xml:space="preserve"/>
-            </w:r>
-          </w:p>
-          <w:p>
-            <w:r>
-              <w:rPr>
-                <w:b w:val="false"/>
-                <w:bCs w:val="false"/>
-                <w:i w:val="false"/>
-                <w:iCs w:val="false"/>
-                <w:color w:val="1A1A1A"/>
-                <w:sz w:val="22"/>
-                <w:szCs w:val="22"/>
-              </w:rPr>
-              <w:t xml:space="preserve"/>
+              <w:t>Tool: Claude Code (Anthropic, model Claude Sonnet 5.5) running inside VS Code, used for most of the engineering in this repository: reviewing the first version of the service, finding and fixing bugs (invalid nDCG, simulated answer-quality numbers, chunker overlap and punctuation, unsafe metadata filter, key-leaking debug endpoint, retired Groq model), writing the evaluation harness, IR metrics, LLM-judge, chunking ablation, scale benchmark, cost model and the 55 tests, adding a live /documents endpoint and sidebar to the UI, writing the README / HANDOVER.md, and filling this document from the result files. Claude also ran the benchmarks and the evaluation and I committed the output. The first version of the service (FastAPI app, LanceDB/Qdrant stores, ingestion pipeline, Vercel/Render deployment) pre-dates this review. The reflection boxes in 1.5 marked as my own words are written by me; I checked the numbers in the README against evaluation/results_*.json. [Candidate: edit this paragraph so it states exactly what you did yourself.]</w:t>
             </w:r>
           </w:p>
         </w:tc>

</xml_diff>

<commit_message>
docs: add candidate walk-through to submission
</commit_message>
<xml_diff>
--- a/submission/Submission_Problem1.docx
+++ b/submission/Submission_Problem1.docx
@@ -4550,63 +4550,19 @@
                 <w:sz w:val="20"/>
                 <w:szCs w:val="20"/>
               </w:rPr>
-              <w:t xml:space="preserve">[ your answer ]</w:t>
-            </w:r>
-          </w:p>
-          <w:p>
-            <w:r>
-              <w:rPr>
-                <w:b w:val="false"/>
-                <w:bCs w:val="false"/>
-                <w:i w:val="false"/>
-                <w:iCs w:val="false"/>
-                <w:color w:val="1A1A1A"/>
-                <w:sz w:val="22"/>
-                <w:szCs w:val="22"/>
-              </w:rPr>
-              <w:t xml:space="preserve"/>
-            </w:r>
-          </w:p>
-          <w:p>
-            <w:r>
-              <w:rPr>
-                <w:b w:val="false"/>
-                <w:bCs w:val="false"/>
-                <w:i w:val="false"/>
-                <w:iCs w:val="false"/>
-                <w:color w:val="1A1A1A"/>
-                <w:sz w:val="22"/>
-                <w:szCs w:val="22"/>
-              </w:rPr>
-              <w:t xml:space="preserve"/>
-            </w:r>
-          </w:p>
-          <w:p>
-            <w:r>
-              <w:rPr>
-                <w:b w:val="false"/>
-                <w:bCs w:val="false"/>
-                <w:i w:val="false"/>
-                <w:iCs w:val="false"/>
-                <w:color w:val="1A1A1A"/>
-                <w:sz w:val="22"/>
-                <w:szCs w:val="22"/>
-              </w:rPr>
-              <w:t xml:space="preserve"/>
-            </w:r>
-          </w:p>
-          <w:p>
-            <w:r>
-              <w:rPr>
-                <w:b w:val="false"/>
-                <w:bCs w:val="false"/>
-                <w:i w:val="false"/>
-                <w:iCs w:val="false"/>
-                <w:color w:val="1A1A1A"/>
-                <w:sz w:val="22"/>
-                <w:szCs w:val="22"/>
-              </w:rPr>
-              <w:t xml:space="preserve"/>
+              <w:t>When a user submits a question on the Vercel frontend, the browser sends a POST request to /query on Render with the question, top_k, and an optional format filter. FastAPI validates the request and returns a 422 error if the input is invalid.</w:t>
+              <w:br/>
+              <w:t>The question is converted into a 384-dimensional embedding using bge-small on the server CPU. LanceDB then searches for the closest chunks using cosine similarity, applying the format filter if one was selected.</w:t>
+              <w:br/>
+              <w:t>One thing I like about this setup is the 0.68 similarity gate before the LLM call. If the best match scores below that threshold, the API returns a fixed message saying it doesn't have enough information. This saves token costs and avoids generating an answer from weak or irrelevant context.</w:t>
+              <w:br/>
+              <w:t>If the results pass the gate, the retrieved chunks are added to a prompt that tells the model to answer only from the provided context and cite its sources. Groq runs Qwen at temperature 0, with a fallback model if the primary one is unavailable or rate-limited. The code then extracts the chunk citations used in the answer and returns them with the response and performance metrics.</w:t>
+              <w:br/>
+              <w:t>In my HNSW test screenshot, retrieval took 800 ms, and the total request took 1,378 ms. The response used 525 tokens and cited 2 chunks. Those numbers help show where the time went and how much context supported the answer.</w:t>
+              <w:br/>
+              <w:t>The API logs the same metrics, and the frontend displays the answer, citation chips, and telemetry bar. The generation_mode field is useful because it tells me how the answer was produced—for example, whether it came from the normal LLM generation path or a fallback/refusal path. I’d check the actual values emitted by the code before drawing conclusions from that field.</w:t>
+              <w:br/>
+              <w:t>If I were improving the system, I’d focus on investigating the HNSW retrieval latency and measuring retrieval quality against a set of test questions. I’d also keep checking whether the similarity threshold rejects useful results or allows weak ones through.</w:t>
             </w:r>
           </w:p>
         </w:tc>

</xml_diff>

<commit_message>
docs: correct walk-through (latency cause, generation_mode values)
</commit_message>
<xml_diff>
--- a/submission/Submission_Problem1.docx
+++ b/submission/Submission_Problem1.docx
@@ -4558,11 +4558,11 @@
               <w:br/>
               <w:t>If the results pass the gate, the retrieved chunks are added to a prompt that tells the model to answer only from the provided context and cite its sources. Groq runs Qwen at temperature 0, with a fallback model if the primary one is unavailable or rate-limited. The code then extracts the chunk citations used in the answer and returns them with the response and performance metrics.</w:t>
               <w:br/>
-              <w:t>In my HNSW test screenshot, retrieval took 800 ms, and the total request took 1,378 ms. The response used 525 tokens and cited 2 chunks. Those numbers help show where the time went and how much context supported the answer.</w:t>
+              <w:t>In my test screenshot (the question was about HNSW), retrieval took 800 ms, and the total request took 1,378 ms. The response used 525 tokens and cited 2 chunks. Those numbers help show where the time went and how much context supported the answer.</w:t>
               <w:br/>
-              <w:t>The API logs the same metrics, and the frontend displays the answer, citation chips, and telemetry bar. The generation_mode field is useful because it tells me how the answer was produced—for example, whether it came from the normal LLM generation path or a fallback/refusal path. I’d check the actual values emitted by the code before drawing conclusions from that field.</w:t>
+              <w:t>The API logs the same metrics, and the frontend displays the answer, citation chips, and telemetry bar. The generation_mode field is useful because it tells me how the answer was produced—for example, whether it came from the normal LLM path (llm), was refused by the similarity gate without calling the LLM (no_context), or fell back to returning the raw top passage because the LLM was unavailable (extractive_fallback).</w:t>
               <w:br/>
-              <w:t>If I were improving the system, I’d focus on investigating the HNSW retrieval latency and measuring retrieval quality against a set of test questions. I’d also keep checking whether the similarity threshold rejects useful results or allows weak ones through.</w:t>
+              <w:t>If I were improving the system, I’d focus on investigating why retrieval took 800 ms on Render when the same search takes about 20 ms locally (probably a cold or busy free-tier server), and measuring retrieval quality against a set of test questions. I’d also keep checking whether the similarity threshold rejects useful results or allows weak ones through.</w:t>
             </w:r>
           </w:p>
         </w:tc>

</xml_diff>

<commit_message>
docs: add 'something that broke' reflection
</commit_message>
<xml_diff>
--- a/submission/Submission_Problem1.docx
+++ b/submission/Submission_Problem1.docx
@@ -4667,49 +4667,17 @@
                 <w:sz w:val="20"/>
                 <w:szCs w:val="20"/>
               </w:rPr>
-              <w:t xml:space="preserve">[ your answer ]</w:t>
-            </w:r>
-          </w:p>
-          <w:p>
-            <w:r>
-              <w:rPr>
-                <w:b w:val="false"/>
-                <w:bCs w:val="false"/>
-                <w:i w:val="false"/>
-                <w:iCs w:val="false"/>
-                <w:color w:val="1A1A1A"/>
-                <w:sz w:val="22"/>
-                <w:szCs w:val="22"/>
-              </w:rPr>
-              <w:t xml:space="preserve"/>
-            </w:r>
-          </w:p>
-          <w:p>
-            <w:r>
-              <w:rPr>
-                <w:b w:val="false"/>
-                <w:bCs w:val="false"/>
-                <w:i w:val="false"/>
-                <w:iCs w:val="false"/>
-                <w:color w:val="1A1A1A"/>
-                <w:sz w:val="22"/>
-                <w:szCs w:val="22"/>
-              </w:rPr>
-              <w:t xml:space="preserve"/>
-            </w:r>
-          </w:p>
-          <w:p>
-            <w:r>
-              <w:rPr>
-                <w:b w:val="false"/>
-                <w:bCs w:val="false"/>
-                <w:i w:val="false"/>
-                <w:iCs w:val="false"/>
-                <w:color w:val="1A1A1A"/>
-                <w:sz w:val="22"/>
-                <w:szCs w:val="22"/>
-              </w:rPr>
-              <w:t xml:space="preserve"/>
+              <w:t>• The problem: the live chat stopped generating normal answers and started returning an "LLM unavailable" error with zero tokens.</w:t>
+              <w:br/>
+              <w:t>• First question: was the fault in the retrieval pipeline or in the LLM itself?</w:t>
+              <w:br/>
+              <w:t>• Diagnosis: we checked the /llm-status endpoint, which showed that llama-3.3-70b-versatile was no longer available for our Groq API key.</w:t>
+              <w:br/>
+              <w:t>• Conclusion: that pointed to the model configuration as the problem, not the retrieval logic.</w:t>
+              <w:br/>
+              <w:t>• Fix: updated the model configuration and added a fallback model, so the application can recover if the primary model becomes unavailable or rate-limited.</w:t>
+              <w:br/>
+              <w:t>• Improvement: add a health check and alerting to detect model failures earlier.</w:t>
             </w:r>
           </w:p>
         </w:tc>

</xml_diff>